<commit_message>
Tarea 1.5: rewrite prose in a clearer first-person student voice
</commit_message>
<xml_diff>
--- a/3er-semestre/visualizacion-grandes-bases-datos/tareas/Tarea1_5/Tarea1_5_VisualizacionGBD_CarlosPulidoRosas.docx
+++ b/3er-semestre/visualizacion-grandes-bases-datos/tareas/Tarea1_5/Tarea1_5_VisualizacionGBD_CarlosPulidoRosas.docx
@@ -559,7 +559,7 @@
           <w:i w:val="0"/>
           <w:sz w:val="20"/>
         </w:rPr>
-        <w:t>En la Tarea 1.4 se identificó el contaminante con mayor correlación lineal con el dióxido de nitrógeno (NO₂) en la estación Centro del Sistema de Monitoreo Atmosférico de Jalisco (SIMAJ). Con base en lo revisado en la sesión 7, en esta actividad se corrigen tres aspectos de aquel análisis: (a) se trabaja con un corpus homogéneo, es decir, con el mismo conjunto de horas para todos los contaminantes; (b) se excluyen los valores atípicos antes de ajustar las regresiones, y (c) las rectas de regresión se fuerzan a pasar por el origen (0, 0). Con los datos ajustados se vuelve a determinar qué contaminante tiene el mayor coeficiente de correlación lineal con el NO₂ y se apoya la respuesta con mapas de calor, gráficas de dispersión, diagramas de caja y rectas de regresión.</w:t>
+        <w:t>En la Tarea 1.4 busqué qué contaminante tiene la correlación lineal más alta con el dióxido de nitrógeno (NO₂) en la estación Centro del SIMAJ. Después de la sesión 7 quedó claro que a ese análisis le faltaban tres ajustes, y en esta tarea los hago. El primero es trabajar con un corpus homogéneo, es decir, que todos los contaminantes se comparen usando exactamente las mismas horas. El segundo es quitar los valores atípicos antes de ajustar las regresiones. El tercero es que las rectas de regresión pasen por el origen (0, 0). Con los datos ya ajustados vuelvo a buscar el contaminante con mayor correlación y reviso el resultado con mapas de calor, gráficas de dispersión, diagramas de caja y rectas de regresión.</w:t>
       </w:r>
     </w:p>
     <w:p>
@@ -609,7 +609,7 @@
           <w:i w:val="0"/>
           <w:sz w:val="20"/>
         </w:rPr>
-        <w:t>En la Tarea 1.4 cada coeficiente se calculó con las horas en que el NO₂ y el contaminante comparado tenían lectura válida, de modo que cada par se basaba en un número distinto de observaciones (entre 2,412 y 2,706) y no necesariamente en las mismas horas. Así, las diferencias entre coeficientes podían deberse en parte a que se comparaban periodos distintos. Además, la estación solo registra NO₂ de septiembre a diciembre de 2024, mientras que el O₃, el CO y las partículas tienen cobertura anual. Para que la comparación sea justa, se conservaron únicamente las horas con lectura válida de las siete variables al mismo tiempo (Tabla 1).</w:t>
+        <w:t>En la Tarea 1.4 calculé cada correlación con las horas en que el NO₂ y el otro contaminante tenían dato. El problema es que cada par terminó usando un número distinto de horas (entre 2,412 y 2,706), y no siempre las mismas. Así, si un coeficiente salía más alto que otro, no se podía saber si era por el contaminante o porque se estaban comparando horas diferentes. A eso se suma que la estación solo midió NO₂ de septiembre a diciembre de 2024, mientras que el O₃, el CO y las partículas se midieron casi todo el año. Para que la comparación fuera justa, me quedé solo con las horas que tienen dato de las siete variables al mismo tiempo (Tabla 1).</w:t>
       </w:r>
     </w:p>
     <w:tbl>
@@ -1000,7 +1000,7 @@
           <w:i w:val="0"/>
           <w:sz w:val="20"/>
         </w:rPr>
-        <w:t>Para identificar los valores atípicos se aplicó el criterio de Tukey visto en las tareas 1.0 y 1.1: una lectura es atípica cuando queda fuera del intervalo [Q1 − 1.5·RIC, Q3 + 1.5·RIC], donde RIC = Q3 − Q1. Las cercas se calcularon por variable sobre el corpus homogéneo. Para no perder la homogeneidad, se excluyó toda hora que fuera atípica en al menos una de las siete variables, de forma que todas las regresiones siguen usando exactamente las mismas horas. Como las distribuciones son asimétricas a la derecha, la cerca inferior es negativa en todos los casos y solo se excluyen concentraciones altas (Tabla 2 y Figura 1).</w:t>
+        <w:t>Para encontrar los atípicos usé el criterio de Tukey de las tareas 1.0 y 1.1. Un valor es atípico si queda fuera del intervalo [Q1 − 1.5·RIC, Q3 + 1.5·RIC], donde RIC = Q3 − Q1. Calculé las cercas de cada variable sobre el corpus homogéneo. Si una hora era atípica en cualquiera de las siete variables, la quité completa, para que todas las regresiones siguieran usando las mismas horas y no se perdiera lo ganado en el paso anterior. Como todas las distribuciones tienen la cola hacia la derecha, la cerca inferior siempre salió negativa, así que solo se quitaron valores altos (Tabla 2 y Figura 1).</w:t>
       </w:r>
     </w:p>
     <w:tbl>
@@ -1966,7 +1966,7 @@
           <w:i w:val="0"/>
           <w:sz w:val="20"/>
         </w:rPr>
-        <w:t>En total se excluyeron 430 horas (18.6 % del corpus homogéneo). El NO concentra la mayor cantidad de atípicos (380), lo que es esperable porque se emite directamente en el escape de los vehículos y presenta picos muy marcados en las horas de mayor tránsito. Las mismas horas suelen ser atípicas en varias variables a la vez, por eso el número de horas excluidas es menor que la suma de la última columna de la Tabla 2.</w:t>
+        <w:t>En total quité 430 horas, el 18.6 % del corpus. El NO es el que tiene más atípicos (380). Tiene sentido, porque sale directo del escape de los coches y se dispara en las horas de más tráfico. Muchas veces una misma hora es atípica en varios contaminantes a la vez, y por eso el total de horas quitadas es menor que la suma de la última columna de la Tabla 2.</w:t>
       </w:r>
     </w:p>
     <w:p>
@@ -1999,7 +1999,7 @@
           <w:i w:val="0"/>
           <w:sz w:val="20"/>
         </w:rPr>
-        <w:t>En lugar de la recta NO₂ = b₀ + b₁X de la Tarea 1.4, se ajustó por mínimos cuadrados el modelo sin intercepto NO₂ = b·X, cuya recta pasa por el punto (0, 0). La restricción tiene sentido físico: cuando no hay emisiones de combustión, la concentración esperada de NO₂ debe ser cercana a cero. La pendiente y el coeficiente de determinación se obtienen con las expresiones de la Figura 2. El R²₀ de un modelo sin intercepto se calcula respecto a cero y no respecto a la media, por lo que su valor no es comparable con el R² de una recta con intercepto ni con el cuadrado de r. Por esa razón, la jerarquía de contaminantes se establece con el coeficiente de correlación de Pearson, y la recta por el origen se usa para describir la proporción entre el NO₂ y cada contaminante.</w:t>
+        <w:t>En la Tarea 1.4 usé la recta NO₂ = b₀ + b₁X. Ahora ajusté por mínimos cuadrados el modelo sin intercepto NO₂ = b·X, que obliga a la recta a pasar por (0, 0). La idea es que, si no hay emisiones, tampoco debería haber NO₂. Las fórmulas de la pendiente y del coeficiente de determinación están en la Figura 2.</w:t>
       </w:r>
     </w:p>
     <w:p>
@@ -2061,6 +2061,22 @@
     </w:p>
     <w:p>
       <w:pPr>
+        <w:keepNext w:val="0"/>
+        <w:spacing w:before="0" w:after="100"/>
+        <w:jc w:val="both"/>
+      </w:pPr>
+      <w:r>
+        <w:rPr>
+          <w:rFonts w:ascii="Calibri" w:hAnsi="Calibri"/>
+          <w:b w:val="0"/>
+          <w:i w:val="0"/>
+          <w:sz w:val="20"/>
+        </w:rPr>
+        <w:t>Hay que tener cuidado con el R²₀. En un modelo sin intercepto el R² se mide contra cero y no contra el promedio, y por eso suele salir más alto de lo que en realidad ajusta el modelo. No se puede comparar con el R² de una recta normal ni con r². Por esa razón usé el coeficiente de Pearson para ordenar los contaminantes, y la recta por el origen solo para ver la proporción entre el NO₂ y cada contaminante.</w:t>
+      </w:r>
+    </w:p>
+    <w:p>
+      <w:pPr>
         <w:keepNext/>
         <w:spacing w:before="200" w:after="60"/>
         <w:jc w:val="left"/>
@@ -2106,7 +2122,7 @@
           <w:i w:val="0"/>
           <w:sz w:val="20"/>
         </w:rPr>
-        <w:t>La Tabla 3 muestra cómo cambia el coeficiente de correlación de cada contaminante con el NO₂ en cada etapa del ajuste, y la Figura 3 compara las matrices de correlación de la Tarea 1.4 y de esta tarea mediante mapas de calor.</w:t>
+        <w:t>En la Tabla 3 se ve cómo cambia la correlación de cada contaminante con el NO₂ después de cada ajuste. La Figura 3 compara las matrices de correlación de la Tarea 1.4 y de esta tarea en mapas de calor, donde el rojo intenso indica correlación positiva fuerte y el azul, negativa.</w:t>
       </w:r>
     </w:p>
     <w:tbl>
@@ -2965,7 +2981,23 @@
           <w:i w:val="0"/>
           <w:sz w:val="20"/>
         </w:rPr>
-        <w:t>El paso al corpus homogéneo apenas modifica los coeficientes (cambios menores a 0.02), lo que indica que la diferencia en el número de horas de la Tarea 1.4 no alteraba los resultados de manera importante. La exclusión de atípicos, en cambio, tiene un efecto claro y en dos sentidos opuestos. La correlación del NO₂ con el NOx sube de 0.814 a 0.942 y la del CO de 0.806 a 0.909. En la Tarea 1.4 se observó que estas relaciones son cóncavas: en las concentraciones altas el NO₂ crece más despacio que el NOx y el CO, y los puntos quedan por debajo de la recta. Esos episodios son precisamente los que el criterio de Tukey identifica como atípicos, y al retirarlos la relación que queda es mucho más cercana a una recta. En el NO, el PM10 y el PM2.5 ocurre lo contrario: su correlación disminuye, porque una parte de ella se debía a unas cuantas horas con valores extremos simultáneos en ambas variables, que actuaban como puntos de alta palanca.</w:t>
+        <w:t>Usar el corpus homogéneo casi no movió los coeficientes (ninguno cambió más de 0.02). O sea, que en la Tarea 1.4 cada par tuviera distintas horas no estaba distorsionando mucho los resultados. Quitar los atípicos, en cambio, sí hizo una diferencia, y no en la misma dirección para todos. En el NOx la correlación subió de 0.814 a 0.942, y en el CO de 0.806 a 0.909.</w:t>
+      </w:r>
+    </w:p>
+    <w:p>
+      <w:pPr>
+        <w:keepNext w:val="0"/>
+        <w:spacing w:before="0" w:after="100"/>
+        <w:jc w:val="both"/>
+      </w:pPr>
+      <w:r>
+        <w:rPr>
+          <w:rFonts w:ascii="Calibri" w:hAnsi="Calibri"/>
+          <w:b w:val="0"/>
+          <w:i w:val="0"/>
+          <w:sz w:val="20"/>
+        </w:rPr>
+        <w:t>Para entender por qué, hay que recordar lo que se vio en la Tarea 1.4. Con el NOx y el CO la nube de puntos se curva: cuando sus concentraciones son muy altas, el NO₂ ya no sube al mismo ritmo y los puntos quedan por debajo de la recta. Esos puntos son justo los que el criterio de Tukey marca como atípicos. Al quitarlos, lo que queda es casi una línea recta, y r sube. En el NO, el PM10 y el PM2.5 pasó lo contrario y la correlación bajó. Ahí unas cuantas horas con valores extremos en las dos variables a la vez jalaban la recta hacia arriba, porque los puntos muy alejados del resto pesan mucho en el cálculo (puntos de alta palanca). Sin ellos, la relación resulta más débil de lo que parecía.</w:t>
       </w:r>
     </w:p>
     <w:p>
@@ -2998,7 +3030,7 @@
           <w:i w:val="0"/>
           <w:sz w:val="20"/>
         </w:rPr>
-        <w:t>La Figura 4 presenta las gráficas de dispersión del corpus depurado con la recta que cruza por el origen (ámbar) y, como referencia, la recta con intercepto (gris punteada). La Tabla 4 reúne los estadísticos de ambos modelos.</w:t>
+        <w:t>La Figura 4 muestra las gráficas de dispersión ya sin atípicos, con la recta que pasa por el origen en ámbar y, para comparar, la recta con intercepto en gris punteado. Los valores de los dos modelos están en la Tabla 4.</w:t>
       </w:r>
     </w:p>
     <w:p>
@@ -4155,7 +4187,7 @@
           <w:i w:val="0"/>
           <w:sz w:val="20"/>
         </w:rPr>
-        <w:t>En el NOx y el CO las dos rectas casi se superponen y el intercepto estimado es muy cercano a cero (+0.0023 y -0.0029 ppm), de modo que la restricción de pasar por el origen es coherente con los datos y casi no cuesta ajuste. La pendiente del NOx (b = 0.735) indica que, en el corpus depurado, el NO₂ representa alrededor de 73.5 % del NOx medido, y la del CO (b = 0.0279) que por cada ppm de CO se observan, en promedio, 27.9 ppb de NO₂.</w:t>
+        <w:t>En el NOx y el CO las dos rectas casi coinciden. Cuando se deja libre el intercepto, sale prácticamente en cero (+0.0023 y -0.0029 ppm), así que obligar a la recta a pasar por el origen no le quita casi nada al ajuste. Las pendientes también se pueden leer de forma sencilla. La del NOx (b = 0.735) quiere decir que el NO₂ es más o menos el 73.5 % del NOx medido. La del CO (b = 0.0279) indica que por cada ppm de CO hay en promedio 27.9 ppb de NO₂.</w:t>
       </w:r>
     </w:p>
     <w:p>
@@ -4171,7 +4203,7 @@
           <w:i w:val="0"/>
           <w:sz w:val="20"/>
         </w:rPr>
-        <w:t>En el resto de los contaminantes la recta por el origen se separa claramente de la recta con intercepto. El caso más ilustrativo es el O₃: su correlación con el NO₂ es negativa (r = -0.523), pero la recta forzada al origen tiene pendiente positiva (b = 0.334), porque la única forma de acercarse a la nube partiendo de (0, 0) es subir hacia ella. En este caso la restricción contradice la relación observada, lo que confirma que el O₃ no responde a la misma fuente que el NO₂ sino a su consumo fotoquímico. Los R²₀ de estas variables son engañosamente altos: calculado respecto a la media, el ajuste de la recta por el origen resulta peor que una línea horizontal en el NO, el O₃ y el PM2.5, ejemplo de por qué el R²₀ no sirve para comparar contaminantes.</w:t>
+        <w:t>Con los demás contaminantes las dos rectas se separan bastante. El caso más claro es el O₃. Su correlación con el NO₂ es negativa (r = -0.523), pero la recta forzada al origen sale con pendiente positiva (b = 0.334), porque si tiene que arrancar en (0, 0), la única manera de acercarse a los puntos es subiendo. Para el O₃ esta restricción no sirve, ya que contradice lo que muestran los datos, y tiene lógica, porque el O₃ no sale de la misma fuente que el NO₂ sino que se forma consumiéndolo. Algo parecido pasa con el R²₀ de estas variables, que sale alto aunque el ajuste sea malo. Si se mide contra el promedio, la recta por el origen ajusta peor que una línea horizontal en el NO, el O₃ y el PM2.5. Por eso no usé el R²₀ para comparar.</w:t>
       </w:r>
     </w:p>
     <w:p>
@@ -4204,7 +4236,7 @@
           <w:i w:val="0"/>
           <w:sz w:val="20"/>
         </w:rPr>
-        <w:t>La Figura 5 combina la gráfica de dispersión con los diagramas de caja de cada eje, como se vio en la sesión 7, para los dos contaminantes con mayor correlación. Las horas excluidas por atípicas aparecen en rojo.</w:t>
+        <w:t>En la Figura 5 junté la gráfica de dispersión con los diagramas de caja de cada eje, como en el ejemplo de la sesión 7, para los dos contaminantes con mayor correlación. Las horas que quité por atípicas están en rojo.</w:t>
       </w:r>
     </w:p>
     <w:p>
@@ -4277,7 +4309,7 @@
           <w:i w:val="0"/>
           <w:sz w:val="20"/>
         </w:rPr>
-        <w:t>Los diagramas de caja muestran que las tres variables tienen una cola larga hacia los valores altos. Las horas excluidas se ubican en esa cola y forman la zona donde la nube se abre y se curva; las horas conservadas siguen una banda estrecha y casi recta que nace en el origen, sobre todo en el caso del NOx. Esta forma explica el aumento de r tras la depuración y confirma visualmente que la recta por el origen es una buena descripción de la relación en el rango habitual de concentraciones.</w:t>
+        <w:t>Los diagramas de caja muestran que el NO₂, el NOx y el CO tienen una cola larga hacia los valores altos. Las horas en rojo están en esa cola, en la zona donde la nube se abre y se dobla. Las horas que se quedaron (en azul) forman una banda angosta y casi recta que sale del origen, sobre todo en el NOx. Con esta gráfica se entiende por qué la correlación subió al quitar los atípicos y por qué la recta por el origen describe bien la relación en los niveles normales de contaminación.</w:t>
       </w:r>
     </w:p>
     <w:p>
@@ -4310,7 +4342,7 @@
           <w:i w:val="0"/>
           <w:sz w:val="20"/>
         </w:rPr>
-        <w:t>Después de homogeneizar el corpus, excluir los valores atípicos y ajustar rectas que cruzan por el origen, el contaminante con el mayor coeficiente de correlación lineal con el NO₂ sigue siendo el NOx (r = 0.942, frente a 0.814 en la Tarea 1.4). Como se señaló en la tarea anterior, este resultado debe leerse con cautela, porque el NOx se obtiene como la suma de NO y NO₂ y, por lo tanto, contiene a la variable con la que se compara.</w:t>
+        <w:t>Después de los tres ajustes, el contaminante con mayor correlación lineal con el NO₂ sigue siendo el NOx, que pasó de r = 0.814 en la Tarea 1.4 a r = 0.942. Como ya había mencionado, este resultado hay que tomarlo con reserva, porque el NOx se calcula sumando el NO y el NO₂. Es decir, ya trae dentro la variable con la que se está comparando.</w:t>
       </w:r>
     </w:p>
     <w:p>
@@ -4326,7 +4358,7 @@
           <w:i w:val="0"/>
           <w:sz w:val="20"/>
         </w:rPr>
-        <w:t>Entre los contaminantes que no incluyen al NO₂ en su cálculo, el de mayor correlación es el CO (r = 0.909), cuya relación con el NO₂ también se fortalece con los ajustes y queda bien descrita por una recta que cruza por el origen (b = 0.0279, intercepto libre de -0.0029 ppm). Ambos contaminantes provienen sobre todo de la combustión vehicular, lo que explica que crezcan de manera proporcional. El O₃ conserva una relación inversa (r = -0.523) y, junto con el NO y las partículas, queda muy por debajo de los dos anteriores.</w:t>
+        <w:t>Si solo se consideran los contaminantes que no incluyen al NO₂, el de mayor correlación es el CO (r = 0.909). Su relación con el NO₂ también mejoró con los ajustes y la describe bien una recta por el origen (b = 0.0279; con intercepto libre, este sale en -0.0029 ppm). Los dos vienen sobre todo de los coches, por eso crecen de forma proporcional. El O₃ mantiene su relación inversa (r = -0.523) y, junto con el NO y las partículas, queda bastante por debajo del NOx y el CO.</w:t>
       </w:r>
     </w:p>
     <w:p>
@@ -4342,7 +4374,7 @@
           <w:i w:val="0"/>
           <w:sz w:val="20"/>
         </w:rPr>
-        <w:t>Los ajustes también muestran que los resultados de la Tarea 1.4 estaban influidos por los valores extremos: en el NOx y el CO ocultaban parte de la relación lineal, mientras que en el NO y las partículas la inflaban. Por último, la recta por el origen solo es adecuada cuando el intercepto libre es cercano a cero, como ocurre con el NOx y el CO; para el O₃ la restricción produce una pendiente con el signo equivocado. En todos los casos se trata de asociaciones estadísticas, que por sí mismas no establecen relaciones de causalidad.</w:t>
+        <w:t>Lo que más me llamó la atención es que los atípicos estaban afectando los resultados de la Tarea 1.4 en sentidos opuestos. En el NOx y el CO escondían parte de la relación lineal, y en el NO y las partículas la hacían ver más fuerte de lo que es. También quedó claro que la recta por el origen solo funciona cuando el intercepto libre ya sale cerca de cero, como con el NOx y el CO. Con el O₃ da una pendiente con el signo al revés. Una correlación alta tampoco significa que un contaminante cause al otro; aquí lo que tienen en común es la fuente.</w:t>
       </w:r>
     </w:p>
     <w:p>

</xml_diff>